<commit_message>
Implement Sprint 16 developer productivity dev: jhaynes
</commit_message>
<xml_diff>
--- a/documentation/word/Relay-Studio-Developer-Onboarding-and-Debugging-Guide.docx
+++ b/documentation/word/Relay-Studio-Developer-Onboarding-and-Debugging-Guide.docx
@@ -53,7 +53,7 @@
         <w:rPr>
           <w:color w:val="5F6B7A"/>
         </w:rPr>
-        <w:t>Version 1.0 | Sprint 15 | July 2026</w:t>
+        <w:t>Version 1.1 | Sprint 16 | July 2026</w:t>
       </w:r>
     </w:p>
     <w:p>
@@ -75,7 +75,7 @@
         <w:t xml:space="preserve">How to use this guide: </w:t>
       </w:r>
       <w:r>
-        <w:t>Read sequentially during onboarding, then return to the subsystem playbooks while debugging. Commands and paths are verified against the repository at Sprint 15.</w:t>
+        <w:t>Read sequentially during onboarding, then return to the subsystem playbooks while debugging. Commands and paths are verified against the repository at Sprint 16.</w:t>
       </w:r>
     </w:p>
     <w:p>
@@ -780,7 +780,7 @@
     </w:p>
     <w:p>
       <w:r>
-        <w:t>The importer accepts a Swagger UI page or direct Swagger/OpenAPI document, validates supported formats, previews operations, and changes the project only after explicit selection.</w:t>
+        <w:t>The importer accepts a Swagger UI page or direct Swagger/OpenAPI document, resolves bounded same-origin references, previews operations and review counts, and changes the project only after explicit selection.</w:t>
       </w:r>
     </w:p>
     <w:p>
@@ -790,7 +790,7 @@
         <w:ind w:left="540" w:hanging="271"/>
       </w:pPr>
       <w:r>
-        <w:t>Separate URL discovery failures from definition parsing failures.</w:t>
+        <w:t>Separate URL discovery failures from definition parsing and external-reference failures.</w:t>
       </w:r>
     </w:p>
     <w:p>
@@ -800,7 +800,17 @@
         <w:ind w:left="540" w:hanging="271"/>
       </w:pPr>
       <w:r>
-        <w:t>Verify relative definition URLs against the page URL.</w:t>
+        <w:t>Verify relative definition and reference URLs against the owning document URL.</w:t>
+      </w:r>
+    </w:p>
+    <w:p>
+      <w:pPr>
+        <w:pStyle w:val="ListBullet"/>
+        <w:spacing w:after="80"/>
+        <w:ind w:left="540" w:hanging="271"/>
+      </w:pPr>
+      <w:r>
+        <w:t>Expect explicit failures for cross-origin, circular, malformed, unreachable, excessively deep, or excessive-document reference graphs.</w:t>
       </w:r>
     </w:p>
     <w:p>
@@ -820,7 +830,7 @@
         <w:ind w:left="540" w:hanging="271"/>
       </w:pPr>
       <w:r>
-        <w:t>Confirm unsupported methods or schemas produce actionable errors.</w:t>
+        <w:t>Confirm PATCH, HEAD, OPTIONS, JSON, URL-encoded forms, and text-only multipart forms map correctly.</w:t>
       </w:r>
     </w:p>
     <w:p>
@@ -840,7 +850,7 @@
         <w:ind w:left="540" w:hanging="271"/>
       </w:pPr>
       <w:r>
-        <w:t>Test Select All, Clear, partial selection, cancellation, and duplicate ID generation.</w:t>
+        <w:t>Test Select All, Clear, partial selection, Add Selected, Add and Save Selected, save cancellation, persistence/reopen, and duplicate ID generation.</w:t>
       </w:r>
     </w:p>
     <w:p>

</xml_diff>

<commit_message>
Implement Sprint 17 native multipart workflows dev: jhaynes
</commit_message>
<xml_diff>
--- a/documentation/word/Relay-Studio-Developer-Onboarding-and-Debugging-Guide.docx
+++ b/documentation/word/Relay-Studio-Developer-Onboarding-and-Debugging-Guide.docx
@@ -53,7 +53,7 @@
         <w:rPr>
           <w:color w:val="5F6B7A"/>
         </w:rPr>
-        <w:t>Version 1.1 | Sprint 16 | July 2026</w:t>
+        <w:t>Version 1.2 | Sprint 17 | July 2026</w:t>
       </w:r>
     </w:p>
     <w:p>
@@ -75,7 +75,7 @@
         <w:t xml:space="preserve">How to use this guide: </w:t>
       </w:r>
       <w:r>
-        <w:t>Read sequentially during onboarding, then return to the subsystem playbooks while debugging. Commands and paths are verified against the repository at Sprint 16.</w:t>
+        <w:t>Read sequentially during onboarding, then return to the subsystem playbooks while debugging. Commands and paths are verified against the repository at Sprint 17.</w:t>
       </w:r>
     </w:p>
     <w:p>
@@ -686,6 +686,20 @@
         </w:numPr>
       </w:pPr>
       <w:r>
+        <w:t>For multipart files, confirm the request is running in Tauri, the path names a readable regular file, the declared media type is valid, the file is no larger than 25 MiB, and no manual Content-Type header is present.</w:t>
+      </w:r>
+    </w:p>
+    <w:p>
+      <w:pPr>
+        <w:pStyle w:val="ListNumber"/>
+        <w:spacing w:after="80"/>
+        <w:ind w:left="540" w:hanging="271"/>
+        <w:numPr>
+          <w:ilvl w:val="0"/>
+          <w:numId w:val="12"/>
+        </w:numPr>
+      </w:pPr>
+      <w:r>
         <w:t>Classify the failure as validation, transport, HTTP response, parsing, mapping, cancellation, or persistence.</w:t>
       </w:r>
     </w:p>
@@ -830,7 +844,7 @@
         <w:ind w:left="540" w:hanging="271"/>
       </w:pPr>
       <w:r>
-        <w:t>Confirm PATCH, HEAD, OPTIONS, JSON, URL-encoded forms, and text-only multipart forms map correctly.</w:t>
+        <w:t>Confirm PATCH, HEAD, OPTIONS, JSON, URL-encoded forms, and mixed text/file multipart forms map correctly.</w:t>
       </w:r>
     </w:p>
     <w:p>
@@ -840,7 +854,7 @@
         <w:ind w:left="540" w:hanging="271"/>
       </w:pPr>
       <w:r>
-        <w:t>Confirm examples do not import bearer tokens, passwords, API keys, cookies, or credentials.</w:t>
+        <w:t>Confirm binary properties become empty file fields and examples do not import file paths, bearer tokens, passwords, API keys, cookies, or credentials.</w:t>
       </w:r>
     </w:p>
     <w:p>

</xml_diff>

<commit_message>
Complete Sprint 18A-18C security hardening dev: jhaynes
</commit_message>
<xml_diff>
--- a/documentation/word/Relay-Studio-Developer-Onboarding-and-Debugging-Guide.docx
+++ b/documentation/word/Relay-Studio-Developer-Onboarding-and-Debugging-Guide.docx
@@ -53,7 +53,7 @@
         <w:rPr>
           <w:color w:val="5F6B7A"/>
         </w:rPr>
-        <w:t>Version 1.2 | Sprint 17 | July 2026</w:t>
+        <w:t>Version 1.7 | Sprint 18C | July 2026</w:t>
       </w:r>
     </w:p>
     <w:p>
@@ -75,7 +75,7 @@
         <w:t xml:space="preserve">How to use this guide: </w:t>
       </w:r>
       <w:r>
-        <w:t>Read sequentially during onboarding, then return to the subsystem playbooks while debugging. Commands and paths are verified against the repository at Sprint 17.</w:t>
+        <w:t>Read sequentially during onboarding, then return to the subsystem playbooks while debugging. Commands and paths are verified against the repository through Sprint 18C.</w:t>
       </w:r>
     </w:p>
     <w:p>
@@ -229,6 +229,7 @@
     <w:p>
       <w:pPr>
         <w:pStyle w:val="Heading1"/>
+        <w:pageBreakBefore w:val="0"/>
       </w:pPr>
       <w:r>
         <w:t>What You Are Joining</w:t>
@@ -277,6 +278,7 @@
     <w:p>
       <w:pPr>
         <w:pStyle w:val="Heading1"/>
+        <w:pageBreakBefore w:val="0"/>
       </w:pPr>
       <w:r>
         <w:t>Workstation Setup</w:t>
@@ -404,6 +406,7 @@
     <w:p>
       <w:pPr>
         <w:pStyle w:val="Heading1"/>
+        <w:pageBreakBefore w:val="0"/>
       </w:pPr>
       <w:r>
         <w:t>Repository Orientation</w:t>
@@ -487,6 +490,7 @@
     <w:p>
       <w:pPr>
         <w:pStyle w:val="Heading1"/>
+        <w:pageBreakBefore w:val="0"/>
       </w:pPr>
       <w:r>
         <w:t>Your First Safe Change</w:t>
@@ -584,6 +588,7 @@
     <w:p>
       <w:pPr>
         <w:pStyle w:val="Heading1"/>
+        <w:pageBreakBefore w:val="0"/>
       </w:pPr>
       <w:r>
         <w:t>Debugging the React Workbench</w:t>
@@ -637,6 +642,7 @@
     <w:p>
       <w:pPr>
         <w:pStyle w:val="Heading1"/>
+        <w:pageBreakBefore/>
       </w:pPr>
       <w:r>
         <w:t>Debugging Requests and Flows</w:t>
@@ -649,13 +655,9 @@
     </w:p>
     <w:p>
       <w:pPr>
-        <w:pStyle w:val="ListNumber"/>
+        <w:pStyle w:val="ListBullet"/>
         <w:spacing w:after="80"/>
         <w:ind w:left="540" w:hanging="271"/>
-        <w:numPr>
-          <w:ilvl w:val="0"/>
-          <w:numId w:val="12"/>
-        </w:numPr>
       </w:pPr>
       <w:r>
         <w:t>Reproduce with the smallest request and a controlled local endpoint.</w:t>
@@ -663,13 +665,9 @@
     </w:p>
     <w:p>
       <w:pPr>
-        <w:pStyle w:val="ListNumber"/>
+        <w:pStyle w:val="ListBullet"/>
         <w:spacing w:after="80"/>
         <w:ind w:left="540" w:hanging="271"/>
-        <w:numPr>
-          <w:ilvl w:val="0"/>
-          <w:numId w:val="12"/>
-        </w:numPr>
       </w:pPr>
       <w:r>
         <w:t>Check resolved URL, headers, query/path parameters, auth mode, timeout, retry policy, and active environment without printing secret values.</w:t>
@@ -677,41 +675,39 @@
     </w:p>
     <w:p>
       <w:pPr>
-        <w:pStyle w:val="ListNumber"/>
+        <w:pStyle w:val="ListBullet"/>
         <w:spacing w:after="80"/>
         <w:ind w:left="540" w:hanging="271"/>
-        <w:numPr>
-          <w:ilvl w:val="0"/>
-          <w:numId w:val="12"/>
-        </w:numPr>
       </w:pPr>
       <w:r>
-        <w:t>For multipart files, confirm the request is running in Tauri, the path names a readable regular file, the declared media type is valid, the file is no larger than 25 MiB, and no manual Content-Type header is present.</w:t>
+        <w:t>For multipart files, confirm the user approved the exact service, field, local path, and destination origin in the current session; then confirm Tauri sees a readable regular file no larger than 25 MiB with a valid media type and no manual Content-Type header.</w:t>
       </w:r>
     </w:p>
     <w:p>
       <w:pPr>
-        <w:pStyle w:val="ListNumber"/>
+        <w:pStyle w:val="ListBullet"/>
         <w:spacing w:after="80"/>
         <w:ind w:left="540" w:hanging="271"/>
-        <w:numPr>
-          <w:ilvl w:val="0"/>
-          <w:numId w:val="12"/>
-        </w:numPr>
       </w:pPr>
       <w:r>
-        <w:t>Classify the failure as validation, transport, HTTP response, parsing, mapping, cancellation, or persistence.</w:t>
+        <w:t>If a reopened project has an empty file path, reselect or re-enter the fixture and approve it; saved projects deliberately do not retain local-file authority.</w:t>
       </w:r>
     </w:p>
     <w:p>
       <w:pPr>
-        <w:pStyle w:val="ListNumber"/>
+        <w:pStyle w:val="ListBullet"/>
         <w:spacing w:after="80"/>
         <w:ind w:left="540" w:hanging="271"/>
-        <w:numPr>
-          <w:ilvl w:val="0"/>
-          <w:numId w:val="12"/>
-        </w:numPr>
+      </w:pPr>
+      <w:r>
+        <w:t>Classify the failure as validation, authorization, transport, HTTP response, parsing, mapping, cancellation, or persistence.</w:t>
+      </w:r>
+    </w:p>
+    <w:p>
+      <w:pPr>
+        <w:pStyle w:val="ListBullet"/>
+        <w:spacing w:after="80"/>
+        <w:ind w:left="540" w:hanging="271"/>
       </w:pPr>
       <w:r>
         <w:t>Inspect the visible console and exported diagnostics for a matching typed error and redacted values.</w:t>
@@ -719,13 +715,9 @@
     </w:p>
     <w:p>
       <w:pPr>
-        <w:pStyle w:val="ListNumber"/>
+        <w:pStyle w:val="ListBullet"/>
         <w:spacing w:after="80"/>
         <w:ind w:left="540" w:hanging="271"/>
-        <w:numPr>
-          <w:ilvl w:val="0"/>
-          <w:numId w:val="12"/>
-        </w:numPr>
       </w:pPr>
       <w:r>
         <w:t>For a flow, inspect the first non-success node and verify downstream blocked/skipped behavior.</w:t>
@@ -734,6 +726,7 @@
     <w:p>
       <w:pPr>
         <w:pStyle w:val="Heading1"/>
+        <w:pageBreakBefore/>
       </w:pPr>
       <w:r>
         <w:t>Debugging Native Tauri Behavior</w:t>
@@ -787,6 +780,7 @@
     <w:p>
       <w:pPr>
         <w:pStyle w:val="Heading1"/>
+        <w:pageBreakBefore/>
       </w:pPr>
       <w:r>
         <w:t>OpenAPI Import Failures</w:t>
@@ -814,7 +808,7 @@
         <w:ind w:left="540" w:hanging="271"/>
       </w:pPr>
       <w:r>
-        <w:t>Verify relative definition and reference URLs against the owning document URL.</w:t>
+        <w:t>Verify Swagger discovery stops after the page fetch, displays the resolved destination, and retrieves it only after the explicit Load action; Cancel must send no second request.</w:t>
       </w:r>
     </w:p>
     <w:p>
@@ -824,7 +818,27 @@
         <w:ind w:left="540" w:hanging="271"/>
       </w:pPr>
       <w:r>
-        <w:t>Expect explicit failures for cross-origin, circular, malformed, unreachable, excessively deep, or excessive-document reference graphs.</w:t>
+        <w:t>Verify every direct and referenced document against its actual final origin, not only its requested URL.</w:t>
+      </w:r>
+    </w:p>
+    <w:p>
+      <w:pPr>
+        <w:pStyle w:val="ListBullet"/>
+        <w:spacing w:after="80"/>
+        <w:ind w:left="540" w:hanging="271"/>
+      </w:pPr>
+      <w:r>
+        <w:t>Expect explicit failures for credential-bearing URLs, cross-origin redirects/references, circular, malformed, unreachable, excessively deep, or excessive-document reference graphs.</w:t>
+      </w:r>
+    </w:p>
+    <w:p>
+      <w:pPr>
+        <w:pStyle w:val="ListBullet"/>
+        <w:spacing w:after="80"/>
+        <w:ind w:left="540" w:hanging="271"/>
+      </w:pPr>
+      <w:r>
+        <w:t>Browser development mode deliberately blocks redirects before loading a document; enter the final definition URL explicitly or verify validated same-origin redirects in desktop mode.</w:t>
       </w:r>
     </w:p>
     <w:p>
@@ -870,6 +884,7 @@
     <w:p>
       <w:pPr>
         <w:pStyle w:val="Heading1"/>
+        <w:pageBreakBefore/>
       </w:pPr>
       <w:r>
         <w:t>Persistence, Recovery, and Concurrent Saves</w:t>
@@ -877,7 +892,7 @@
     </w:p>
     <w:p>
       <w:r>
-        <w:t>Project persistence validates the schema, redacts secret-bearing values, protects concurrent saves, creates recovery backups, and uses native atomic replacement where available.</w:t>
+        <w:t>Project persistence deeply validates schema-v1 state, canonically redacts secret-bearing values, removes multipart file authority, protects concurrent saves, creates recovery backups, and uses native atomic replacement where available.</w:t>
       </w:r>
     </w:p>
     <w:p>
@@ -887,7 +902,7 @@
         <w:ind w:left="540" w:hanging="271"/>
       </w:pPr>
       <w:r>
-        <w:t>Do not bypass schema validation to open a malformed project.</w:t>
+        <w:t>Do not bypass nested schema validation to open malformed services, environments, flows, responses, imports, or settings.</w:t>
       </w:r>
     </w:p>
     <w:p>
@@ -897,7 +912,17 @@
         <w:ind w:left="540" w:hanging="271"/>
       </w:pPr>
       <w:r>
-        <w:t>Preserve the original error and provide recovery guidance.</w:t>
+        <w:t>Older schema-v1 files may omit settings introduced later; verify those missing fields receive current typed defaults while explicitly malformed values still fail.</w:t>
+      </w:r>
+    </w:p>
+    <w:p>
+      <w:pPr>
+        <w:pStyle w:val="ListBullet"/>
+        <w:spacing w:after="80"/>
+        <w:ind w:left="540" w:hanging="271"/>
+      </w:pPr>
+      <w:r>
+        <w:t>Preserve the exact failing field path and provide recovery guidance.</w:t>
       </w:r>
     </w:p>
     <w:p>
@@ -917,6 +942,16 @@
         <w:ind w:left="540" w:hanging="271"/>
       </w:pPr>
       <w:r>
+        <w:t>Confirm query/path/form canaries, URL userinfo, sensitive query values, and credential-shaped flow captures cannot survive save/reload.</w:t>
+      </w:r>
+    </w:p>
+    <w:p>
+      <w:pPr>
+        <w:pStyle w:val="ListBullet"/>
+        <w:spacing w:after="80"/>
+        <w:ind w:left="540" w:hanging="271"/>
+      </w:pPr>
+      <w:r>
         <w:t>Simulate a second save and verify it fails explicitly instead of racing.</w:t>
       </w:r>
     </w:p>
@@ -933,6 +968,7 @@
     <w:p>
       <w:pPr>
         <w:pStyle w:val="Heading1"/>
+        <w:pageBreakBefore w:val="0"/>
       </w:pPr>
       <w:r>
         <w:t>Diagnostics and Secret Safety</w:t>
@@ -940,7 +976,7 @@
     </w:p>
     <w:p>
       <w:r>
-        <w:t>Treat logs, screenshots, saved responses, project exports, test fixtures, and diagnostics bundles as possible exfiltration paths.</w:t>
+        <w:t>Treat logs, screenshots, saved responses, project exports, test fixtures, normalized errors, and diagnostics bundles as possible exfiltration paths.</w:t>
       </w:r>
     </w:p>
     <w:p>
@@ -950,7 +986,7 @@
         <w:ind w:left="540" w:hanging="271"/>
       </w:pPr>
       <w:r>
-        <w:t>Use the shared redaction utility; do not invent local masking logic.</w:t>
+        <w:t>Use the shared canonical redaction utility; do not invent local masking logic.</w:t>
       </w:r>
     </w:p>
     <w:p>
@@ -960,7 +996,17 @@
         <w:ind w:left="540" w:hanging="271"/>
       </w:pPr>
       <w:r>
-        <w:t>Test bearer tokens, passwords, API keys, basic auth, cookies, client secrets, custom auth headers, and secret variables.</w:t>
+        <w:t>Test bearer tokens, passwords, API-key spelling variants, cookies, client secrets, URL userinfo, sensitive query values, custom auth headers, and secret variables.</w:t>
+      </w:r>
+    </w:p>
+    <w:p>
+      <w:pPr>
+        <w:pStyle w:val="ListBullet"/>
+        <w:spacing w:after="80"/>
+        <w:ind w:left="540" w:hanging="271"/>
+      </w:pPr>
+      <w:r>
+        <w:t>Reapply canonical redaction when reopening or comparing an artifact; never trust a persisted redacted flag by itself.</w:t>
       </w:r>
     </w:p>
     <w:p>
@@ -986,6 +1032,7 @@
     <w:p>
       <w:pPr>
         <w:pStyle w:val="Heading1"/>
+        <w:pageBreakBefore/>
       </w:pPr>
       <w:r>
         <w:t>Test Selection and Release Gates</w:t>
@@ -1143,6 +1190,7 @@
     <w:p>
       <w:pPr>
         <w:pStyle w:val="Heading1"/>
+        <w:pageBreakBefore w:val="0"/>
       </w:pPr>
       <w:r>
         <w:t>Common Failure Playbook</w:t>
@@ -1211,6 +1259,7 @@
     <w:p>
       <w:pPr>
         <w:pStyle w:val="Heading1"/>
+        <w:pageBreakBefore/>
       </w:pPr>
       <w:r>
         <w:t>Junior Developer Exercises</w:t>
@@ -1223,7 +1272,7 @@
         <w:ind w:left="540" w:hanging="271"/>
         <w:numPr>
           <w:ilvl w:val="0"/>
-          <w:numId w:val="13"/>
+          <w:numId w:val="12"/>
         </w:numPr>
       </w:pPr>
       <w:r>
@@ -1237,7 +1286,7 @@
         <w:ind w:left="540" w:hanging="271"/>
         <w:numPr>
           <w:ilvl w:val="0"/>
-          <w:numId w:val="13"/>
+          <w:numId w:val="12"/>
         </w:numPr>
       </w:pPr>
       <w:r>
@@ -1251,7 +1300,7 @@
         <w:ind w:left="540" w:hanging="271"/>
         <w:numPr>
           <w:ilvl w:val="0"/>
-          <w:numId w:val="13"/>
+          <w:numId w:val="12"/>
         </w:numPr>
       </w:pPr>
       <w:r>
@@ -1265,7 +1314,7 @@
         <w:ind w:left="540" w:hanging="271"/>
         <w:numPr>
           <w:ilvl w:val="0"/>
-          <w:numId w:val="13"/>
+          <w:numId w:val="12"/>
         </w:numPr>
       </w:pPr>
       <w:r>
@@ -1279,7 +1328,7 @@
         <w:ind w:left="540" w:hanging="271"/>
         <w:numPr>
           <w:ilvl w:val="0"/>
-          <w:numId w:val="13"/>
+          <w:numId w:val="12"/>
         </w:numPr>
       </w:pPr>
       <w:r>
@@ -1293,7 +1342,7 @@
         <w:ind w:left="540" w:hanging="271"/>
         <w:numPr>
           <w:ilvl w:val="0"/>
-          <w:numId w:val="13"/>
+          <w:numId w:val="12"/>
         </w:numPr>
       </w:pPr>
       <w:r>
@@ -1303,6 +1352,7 @@
     <w:p>
       <w:pPr>
         <w:pStyle w:val="Heading1"/>
+        <w:pageBreakBefore/>
       </w:pPr>
       <w:r>
         <w:t>Definition of Done</w:t>
@@ -1648,12 +1698,6 @@
     </w:lvlOverride>
   </w:num>
   <w:num w:numId="12">
-    <w:abstractNumId w:val="7"/>
-    <w:lvlOverride w:ilvl="0">
-      <w:startOverride w:val="1"/>
-    </w:lvlOverride>
-  </w:num>
-  <w:num w:numId="13">
     <w:abstractNumId w:val="7"/>
     <w:lvlOverride w:ilvl="0">
       <w:startOverride w:val="1"/>

</xml_diff>

<commit_message>
Implement Sprint 18D execution integrity and resource bounds dev: jhaynes
</commit_message>
<xml_diff>
--- a/documentation/word/Relay-Studio-Developer-Onboarding-and-Debugging-Guide.docx
+++ b/documentation/word/Relay-Studio-Developer-Onboarding-and-Debugging-Guide.docx
@@ -53,7 +53,7 @@
         <w:rPr>
           <w:color w:val="5F6B7A"/>
         </w:rPr>
-        <w:t>Version 1.7 | Sprint 18C | July 2026</w:t>
+        <w:t>Version 1.8 | Sprint 18D | July 2026</w:t>
       </w:r>
     </w:p>
     <w:p>
@@ -75,7 +75,7 @@
         <w:t xml:space="preserve">How to use this guide: </w:t>
       </w:r>
       <w:r>
-        <w:t>Read sequentially during onboarding, then return to the subsystem playbooks while debugging. Commands and paths are verified against the repository through Sprint 18C.</w:t>
+        <w:t>Read sequentially during onboarding, then return to the subsystem playbooks while debugging. Commands and paths are verified against the repository through Sprint 18D.</w:t>
       </w:r>
     </w:p>
     <w:p>
@@ -922,6 +922,16 @@
         <w:ind w:left="540" w:hanging="271"/>
       </w:pPr>
       <w:r>
+        <w:t>Project save/open/backup restore are bounded at 4 MiB before parse; verify the boundary and actionable oversized-file recovery path.</w:t>
+      </w:r>
+    </w:p>
+    <w:p>
+      <w:pPr>
+        <w:pStyle w:val="ListBullet"/>
+        <w:spacing w:after="80"/>
+        <w:ind w:left="540" w:hanging="271"/>
+      </w:pPr>
+      <w:r>
         <w:t>Preserve the exact failing field path and provide recovery guidance.</w:t>
       </w:r>
     </w:p>
@@ -943,6 +953,16 @@
       </w:pPr>
       <w:r>
         <w:t>Confirm query/path/form canaries, URL userinfo, sensitive query values, and credential-shaped flow captures cannot survive save/reload.</w:t>
+      </w:r>
+    </w:p>
+    <w:p>
+      <w:pPr>
+        <w:pStyle w:val="ListBullet"/>
+        <w:spacing w:after="80"/>
+        <w:ind w:left="540" w:hanging="271"/>
+      </w:pPr>
+      <w:r>
+        <w:t>Flow runtime captures are available only inside the active run and are not written back to persistable environments.</w:t>
       </w:r>
     </w:p>
     <w:p>

</xml_diff>

<commit_message>
Harden delivery gates and close Sprint 18E dev: jhaynes
</commit_message>
<xml_diff>
--- a/documentation/word/Relay-Studio-Developer-Onboarding-and-Debugging-Guide.docx
+++ b/documentation/word/Relay-Studio-Developer-Onboarding-and-Debugging-Guide.docx
@@ -53,7 +53,7 @@
         <w:rPr>
           <w:color w:val="5F6B7A"/>
         </w:rPr>
-        <w:t>Version 1.8 | Sprint 18D | July 2026</w:t>
+        <w:t>Version 1.8 | Sprint 18E | July 2026</w:t>
       </w:r>
     </w:p>
     <w:p>
@@ -75,7 +75,7 @@
         <w:t xml:space="preserve">How to use this guide: </w:t>
       </w:r>
       <w:r>
-        <w:t>Read sequentially during onboarding, then return to the subsystem playbooks while debugging. Commands and paths are verified against the repository through Sprint 18D.</w:t>
+        <w:t>Read sequentially during onboarding, then return to the subsystem playbooks while debugging. Commands and paths are verified against the repository through Sprint 18E.</w:t>
       </w:r>
     </w:p>
     <w:p>

</xml_diff>

<commit_message>
Sprint 19 Request and flow tabs now expose Generate Code language submenus and a local, read-only popup for HTTP, cURL, C#, Java, jQuery, Node.js, PHP, Python, and Ruby.
dev: jhaynes
</commit_message>
<xml_diff>
--- a/documentation/word/Relay-Studio-Developer-Onboarding-and-Debugging-Guide.docx
+++ b/documentation/word/Relay-Studio-Developer-Onboarding-and-Debugging-Guide.docx
@@ -53,7 +53,7 @@
         <w:rPr>
           <w:color w:val="5F6B7A"/>
         </w:rPr>
-        <w:t>Version 1.8 | Sprint 18E | July 2026</w:t>
+        <w:t>Version 1.9 | Sprint 19 | July 2026</w:t>
       </w:r>
     </w:p>
     <w:p>
@@ -75,7 +75,7 @@
         <w:t xml:space="preserve">How to use this guide: </w:t>
       </w:r>
       <w:r>
-        <w:t>Read sequentially during onboarding, then return to the subsystem playbooks while debugging. Commands and paths are verified against the repository through Sprint 18E.</w:t>
+        <w:t>Read sequentially during onboarding, then return to the subsystem playbooks while debugging. Commands and paths are verified against the repository through Sprint 19.</w:t>
       </w:r>
     </w:p>
     <w:p>
@@ -700,7 +700,17 @@
         <w:ind w:left="540" w:hanging="271"/>
       </w:pPr>
       <w:r>
-        <w:t>Classify the failure as validation, authorization, transport, HTTP response, parsing, mapping, cancellation, or persistence.</w:t>
+        <w:t>For code examples, reproduce from the tab context menu, compare the generated request with the typed model, and verify credential/file placeholders before debugging language syntax.</w:t>
+      </w:r>
+    </w:p>
+    <w:p>
+      <w:pPr>
+        <w:pStyle w:val="ListBullet"/>
+        <w:spacing w:after="80"/>
+        <w:ind w:left="540" w:hanging="271"/>
+      </w:pPr>
+      <w:r>
+        <w:t>Classify the failure as validation, authorization, transport, HTTP response, parsing, mapping, cancellation, persistence, or code generation.</w:t>
       </w:r>
     </w:p>
     <w:p>

</xml_diff>